<commit_message>
preview: deploy pr-7 from 2ece6d27a943adcecce3505a0092c38273e0f8c7 6b77830292da100abfb351f37e73126f65f05b79
</commit_message>
<xml_diff>
--- a/pr-7/KRISH_PAVULURI_CV.docx
+++ b/pr-7/KRISH_PAVULURI_CV.docx
@@ -44,7 +44,7 @@
         </w:rPr>
         <w:t xml:space="preserve">Montreal, QC  |  438-928-0928  |  </w:t>
       </w:r>
-      <w:hyperlink w:history="1" r:id="rIdjnyzyadzcbeahmgnypkc4">
+      <w:hyperlink w:history="1" r:id="rId22353v73mwjzq0vckhdhp">
         <w:r>
           <w:rPr>
             <w:rStyle w:val="Hyperlink"/>
@@ -61,7 +61,7 @@
         </w:rPr>
         <w:t xml:space="preserve">  |  </w:t>
       </w:r>
-      <w:hyperlink w:history="1" r:id="rIdmj3lgitq8ta4wyra3-l3u">
+      <w:hyperlink w:history="1" r:id="rIdjomf7h76i-oq_ljkhot6f">
         <w:r>
           <w:rPr>
             <w:rStyle w:val="Hyperlink"/>
@@ -78,7 +78,7 @@
         </w:rPr>
         <w:t xml:space="preserve">  |  </w:t>
       </w:r>
-      <w:hyperlink w:history="1" r:id="rIdf5rz_yey0gre4s6u37d5-">
+      <w:hyperlink w:history="1" r:id="rIdcoqb2h9g-ccn8dweluf3d">
         <w:r>
           <w:rPr>
             <w:rStyle w:val="Hyperlink"/>
@@ -422,7 +422,7 @@
           <w:sz w:val="18"/>
           <w:szCs w:val="18"/>
         </w:rPr>
-        <w:t xml:space="preserve">Banking automation on Symitar and Backbase using Python/PyTest, TestNG with Java, Playwright with TypeScript, GitHub Actions, and Azure DevOps, with an agentic AI test-generation platform layered on top.</w:t>
+        <w:t xml:space="preserve">Banking automation on Symitar and Backbase across web and mobile using Python/PyTest, TestNG with Java, Playwright with TypeScript, and Appium for iOS/Android, wired into GitHub Actions and Azure DevOps, with an agentic AI test-generation platform layered on top.</w:t>
       </w:r>
     </w:p>
     <w:p>
@@ -491,23 +491,6 @@
           <w:szCs w:val="18"/>
         </w:rPr>
         <w:t xml:space="preserve">Built and maintained Playwright/TypeScript suites for UI and end-to-end banking flows, expanding frontend coverage and surfacing defects earlier in the cycle.</w:t>
-      </w:r>
-    </w:p>
-    <w:p>
-      <w:pPr>
-        <w:pStyle w:val="ListParagraph"/>
-        <w:numPr>
-          <w:ilvl w:val="0"/>
-          <w:numId w:val="1"/>
-        </w:numPr>
-        <w:spacing w:after="50"/>
-      </w:pPr>
-      <w:r>
-        <w:rPr>
-          <w:sz w:val="18"/>
-          <w:szCs w:val="18"/>
-        </w:rPr>
-        <w:t xml:space="preserve">Automated SOAP API validation with SOAP UI and integrated results into Azure DevOps for real-time reporting against user stories.</w:t>
       </w:r>
     </w:p>
     <w:p>
@@ -530,7 +513,7 @@
           <w:sz w:val="16"/>
           <w:szCs w:val="16"/>
         </w:rPr>
-        <w:t xml:space="preserve">Playwright · TypeScript · Python · PyTest · TestNG · Java · Claude Code · Playwright MCP · Ollama · Azure OpenAI · AWS Bedrock · Vertex AI · GitHub Actions · Azure DevOps · SOAP UI</w:t>
+        <w:t xml:space="preserve">Playwright · TypeScript · Appium · Python · PyTest · TestNG · Java · Claude Code · Playwright MCP · Ollama · Azure OpenAI · AWS Bedrock · Vertex AI · GitHub Actions · Azure DevOps · SOAP UI</w:t>
       </w:r>
     </w:p>
     <w:p>

</xml_diff>

<commit_message>
preview: deploy pr-7 from 2376fb6f2e0877d60e597efd4aef13ac6ea39d78 edd61bf0af8f108d66851a2f6bc376248674cd61
</commit_message>
<xml_diff>
--- a/pr-7/KRISH_PAVULURI_CV.docx
+++ b/pr-7/KRISH_PAVULURI_CV.docx
@@ -44,7 +44,7 @@
         </w:rPr>
         <w:t xml:space="preserve">Montreal, QC  |  438-928-0928  |  </w:t>
       </w:r>
-      <w:hyperlink w:history="1" r:id="rId22353v73mwjzq0vckhdhp">
+      <w:hyperlink w:history="1" r:id="rId3mnnc2zl8sssaq_0rmnec">
         <w:r>
           <w:rPr>
             <w:rStyle w:val="Hyperlink"/>
@@ -61,7 +61,7 @@
         </w:rPr>
         <w:t xml:space="preserve">  |  </w:t>
       </w:r>
-      <w:hyperlink w:history="1" r:id="rIdjomf7h76i-oq_ljkhot6f">
+      <w:hyperlink w:history="1" r:id="rIdyrxgs0elvv0wru3_sda2o">
         <w:r>
           <w:rPr>
             <w:rStyle w:val="Hyperlink"/>
@@ -78,7 +78,7 @@
         </w:rPr>
         <w:t xml:space="preserve">  |  </w:t>
       </w:r>
-      <w:hyperlink w:history="1" r:id="rIdcoqb2h9g-ccn8dweluf3d">
+      <w:hyperlink w:history="1" r:id="rIdk-0r_lwukx8kzkxc6tc5d">
         <w:r>
           <w:rPr>
             <w:rStyle w:val="Hyperlink"/>

</xml_diff>

<commit_message>
preview: deploy pr-7 from a5f64681a7cb81413da28af84e0b19d096ce6d66 ff0416dc6331b2ada2e286b68c7a39208a10721a
</commit_message>
<xml_diff>
--- a/pr-7/KRISH_PAVULURI_CV.docx
+++ b/pr-7/KRISH_PAVULURI_CV.docx
@@ -44,7 +44,7 @@
         </w:rPr>
         <w:t xml:space="preserve">Montreal, QC  |  438-928-0928  |  </w:t>
       </w:r>
-      <w:hyperlink w:history="1" r:id="rId3mnnc2zl8sssaq_0rmnec">
+      <w:hyperlink w:history="1" r:id="rIdf5rxnyz9nqea5n3eib_-t">
         <w:r>
           <w:rPr>
             <w:rStyle w:val="Hyperlink"/>
@@ -61,7 +61,7 @@
         </w:rPr>
         <w:t xml:space="preserve">  |  </w:t>
       </w:r>
-      <w:hyperlink w:history="1" r:id="rIdyrxgs0elvv0wru3_sda2o">
+      <w:hyperlink w:history="1" r:id="rIdl0dnvmdq382pqspzssfza">
         <w:r>
           <w:rPr>
             <w:rStyle w:val="Hyperlink"/>
@@ -78,7 +78,7 @@
         </w:rPr>
         <w:t xml:space="preserve">  |  </w:t>
       </w:r>
-      <w:hyperlink w:history="1" r:id="rIdk-0r_lwukx8kzkxc6tc5d">
+      <w:hyperlink w:history="1" r:id="rIdhzs-h1zmhyq4exiv1leiv">
         <w:r>
           <w:rPr>
             <w:rStyle w:val="Hyperlink"/>

</xml_diff>